<commit_message>
Add common mistakes reference file and enhance QA checks
- Introduced a new file `qa_ai_common_mistakes.txt` detailing known AI check mistakes to aid in error avoidance during analysis.
- Updated `structural_qa_rag_knowledge_pack.docx` for terminology consistency and clarity.
- Enhanced `state.py` to include a `not_found` field for checks where required drawing information is absent.
- Modified `aggregate.py` to prevent deduplication of summary items and maintain their adjacency to individual findings.
- Improved `bend_check.py` and `rebar_check.py` with clearer procedures and checks for various reinforcement elements.
- Updated UI components to reflect new checks and not_found counts for better user feedback.
</commit_message>
<xml_diff>
--- a/QA AI Drawing/QA Knowledge/structural_qa_rag_knowledge_pack.docx
+++ b/QA AI Drawing/QA Knowledge/structural_qa_rag_knowledge_pack.docx
@@ -24,15 +24,7 @@
         <w:pStyle w:val="ListParagraph"/>
       </w:pPr>
       <w:r>
-        <w:t>D:\QA Agent\</w:t>
-      </w:r>
-      <w:proofErr w:type="spellStart"/>
-      <w:r>
-        <w:t>qa_agent</w:t>
-      </w:r>
-      <w:proofErr w:type="spellEnd"/>
-      <w:r>
-        <w:t>\QA AI Drawing\QA Knowledge\Sample drawings</w:t>
+        <w:t>D:\QA Agent\qa_agent\QA AI Drawing\QA Knowledge\Sample drawings</w:t>
       </w:r>
     </w:p>
     <w:p>
@@ -43,19 +35,15 @@
           <w:numId w:val="10"/>
         </w:numPr>
       </w:pPr>
-      <w:proofErr w:type="gramStart"/>
-      <w:r>
-        <w:t>explain</w:t>
-      </w:r>
-      <w:proofErr w:type="gramEnd"/>
+      <w:r>
+        <w:t>Explaining</w:t>
+      </w:r>
       <w:r>
         <w:t xml:space="preserve"> </w:t>
       </w:r>
-      <w:proofErr w:type="gramStart"/>
       <w:r>
         <w:t>terminology</w:t>
       </w:r>
-      <w:proofErr w:type="gramEnd"/>
     </w:p>
     <w:p>
       <w:pPr>
@@ -78,11 +66,9 @@
         </w:numPr>
         <w:ind w:left="1080"/>
       </w:pPr>
-      <w:proofErr w:type="spellStart"/>
       <w:r>
         <w:t>Ansicht</w:t>
       </w:r>
-      <w:proofErr w:type="spellEnd"/>
       <w:r>
         <w:t xml:space="preserve">: </w:t>
       </w:r>
@@ -173,11 +159,9 @@
         </w:numPr>
         <w:ind w:left="1080"/>
       </w:pPr>
-      <w:proofErr w:type="spellStart"/>
       <w:r>
         <w:t>Bewehrung</w:t>
       </w:r>
-      <w:proofErr w:type="spellEnd"/>
       <w:r>
         <w:t xml:space="preserve">: </w:t>
       </w:r>
@@ -194,11 +178,9 @@
         </w:numPr>
         <w:ind w:left="1080"/>
       </w:pPr>
-      <w:proofErr w:type="spellStart"/>
       <w:r>
         <w:t>Draufsicht</w:t>
       </w:r>
-      <w:proofErr w:type="spellEnd"/>
       <w:r>
         <w:t xml:space="preserve"> = Top view / Plan view in technical drawing</w:t>
       </w:r>
@@ -215,11 +197,9 @@
         </w:numPr>
         <w:ind w:left="1080"/>
       </w:pPr>
-      <w:proofErr w:type="spellStart"/>
       <w:r>
         <w:t>Stabliste</w:t>
       </w:r>
-      <w:proofErr w:type="spellEnd"/>
       <w:r>
         <w:t xml:space="preserve"> = Bar list / Rebar schedule in reinforcement drawings.</w:t>
       </w:r>
@@ -233,22 +213,24 @@
         </w:numPr>
         <w:ind w:left="1080"/>
       </w:pPr>
-      <w:proofErr w:type="spellStart"/>
       <w:r>
         <w:t>Einbauteilliste</w:t>
       </w:r>
-      <w:proofErr w:type="spellEnd"/>
+      <w:r>
+        <w:t xml:space="preserve"> </w:t>
+      </w:r>
+      <w:r>
+        <w:t>(je Fertigteil)</w:t>
+      </w:r>
       <w:r>
         <w:t xml:space="preserve"> = Embedded parts list</w:t>
       </w:r>
       <w:r>
         <w:t xml:space="preserve">/built in part list. This is the table </w:t>
       </w:r>
-      <w:proofErr w:type="gramStart"/>
-      <w:r>
-        <w:t>summarize</w:t>
-      </w:r>
-      <w:proofErr w:type="gramEnd"/>
+      <w:r>
+        <w:t>summarizes</w:t>
+      </w:r>
       <w:r>
         <w:t xml:space="preserve"> the product need to place inside the precast element</w:t>
       </w:r>
@@ -262,21 +244,8 @@
         </w:numPr>
         <w:ind w:left="1080"/>
       </w:pPr>
-      <w:proofErr w:type="spellStart"/>
-      <w:r>
-        <w:t>Montageteilliste</w:t>
-      </w:r>
-      <w:proofErr w:type="spellEnd"/>
-      <w:r>
-        <w:t xml:space="preserve"> (je </w:t>
-      </w:r>
-      <w:proofErr w:type="spellStart"/>
-      <w:r>
-        <w:t>Fertigteil</w:t>
-      </w:r>
-      <w:proofErr w:type="spellEnd"/>
-      <w:r>
-        <w:t>)</w:t>
+      <w:r>
+        <w:t>Montageteilliste (je Fertigteil)</w:t>
       </w:r>
       <w:r>
         <w:t xml:space="preserve"> = Assembly parts list (</w:t>
@@ -284,11 +253,9 @@
       <w:r>
         <w:t xml:space="preserve">This is the table </w:t>
       </w:r>
-      <w:proofErr w:type="gramStart"/>
-      <w:r>
-        <w:t>summarize</w:t>
-      </w:r>
-      <w:proofErr w:type="gramEnd"/>
+      <w:r>
+        <w:t>summarizes</w:t>
+      </w:r>
       <w:r>
         <w:t xml:space="preserve"> mounting part </w:t>
       </w:r>
@@ -305,13 +272,8 @@
         </w:numPr>
         <w:ind w:left="1080"/>
       </w:pPr>
-      <w:proofErr w:type="spellStart"/>
-      <w:r>
-        <w:t>Wandansicht</w:t>
-      </w:r>
-      <w:proofErr w:type="spellEnd"/>
-      <w:r>
-        <w:t xml:space="preserve"> = Wall elevation / Wall view.</w:t>
+      <w:r>
+        <w:t>Wandansicht = Wall elevation / Wall view.</w:t>
       </w:r>
     </w:p>
     <w:p>
@@ -323,13 +285,8 @@
         </w:numPr>
         <w:ind w:left="1080"/>
       </w:pPr>
-      <w:proofErr w:type="spellStart"/>
-      <w:r>
-        <w:t>Lastausgleichsgehänge</w:t>
-      </w:r>
-      <w:proofErr w:type="spellEnd"/>
-      <w:r>
-        <w:t xml:space="preserve"> = Load-balancing hanger / Suspension support.</w:t>
+      <w:r>
+        <w:t>Lastausgleichsgehänge = Load-balancing hanger / Suspension support.</w:t>
       </w:r>
     </w:p>
     <w:p>
@@ -354,13 +311,8 @@
         </w:numPr>
         <w:ind w:left="1080"/>
       </w:pPr>
-      <w:proofErr w:type="spellStart"/>
-      <w:r>
-        <w:t>Mattenstahlliste</w:t>
-      </w:r>
-      <w:proofErr w:type="spellEnd"/>
-      <w:r>
-        <w:t xml:space="preserve"> is a table listing of mesh rebar</w:t>
+      <w:r>
+        <w:t>Mattenstahlliste is a table listing of mesh rebar</w:t>
       </w:r>
     </w:p>
     <w:p>
@@ -373,15 +325,7 @@
         <w:ind w:left="1080"/>
       </w:pPr>
       <w:r>
-        <w:t>Matten-</w:t>
-      </w:r>
-      <w:proofErr w:type="spellStart"/>
-      <w:r>
-        <w:t>Schneideskizze</w:t>
-      </w:r>
-      <w:proofErr w:type="spellEnd"/>
-      <w:r>
-        <w:t xml:space="preserve"> = A drawing/sketch showing how reinforcement mesh is cut and shaped before installation.</w:t>
+        <w:t>Matten-Schneideskizze = A drawing/sketch showing how reinforcement mesh is cut and shaped before installation.</w:t>
       </w:r>
     </w:p>
     <w:p>
@@ -406,35 +350,27 @@
       <w:pPr>
         <w:pStyle w:val="ListParagraph"/>
       </w:pPr>
-      <w:proofErr w:type="gramStart"/>
-      <w:r>
-        <w:t>will be</w:t>
-      </w:r>
-      <w:proofErr w:type="gramEnd"/>
+      <w:r>
+        <w:t>will</w:t>
+      </w:r>
       <w:r>
         <w:t xml:space="preserve"> check </w:t>
       </w:r>
-      <w:proofErr w:type="gramStart"/>
-      <w:r>
-        <w:t>all of</w:t>
-      </w:r>
-      <w:proofErr w:type="gramEnd"/>
+      <w:r>
+        <w:t>all</w:t>
+      </w:r>
       <w:r>
         <w:t xml:space="preserve"> </w:t>
       </w:r>
-      <w:proofErr w:type="gramStart"/>
-      <w:r>
-        <w:t>this</w:t>
-      </w:r>
-      <w:proofErr w:type="gramEnd"/>
+      <w:r>
+        <w:t>these</w:t>
+      </w:r>
       <w:r>
         <w:t xml:space="preserve"> issues below and report this pass or fail if fail display why it’s </w:t>
       </w:r>
-      <w:proofErr w:type="gramStart"/>
-      <w:r>
-        <w:t>fail</w:t>
-      </w:r>
-      <w:proofErr w:type="gramEnd"/>
+      <w:r>
+        <w:t>failed</w:t>
+      </w:r>
       <w:r>
         <w:t>.</w:t>
       </w:r>
@@ -464,47 +400,7 @@
       </w:r>
       <w:r>
         <w:br/>
-        <w:t xml:space="preserve">For example, if sections 1-1, 2-2, and 3-3 are shown in the </w:t>
-      </w:r>
-      <w:proofErr w:type="spellStart"/>
-      <w:r>
-        <w:t>Ansicht</w:t>
-      </w:r>
-      <w:proofErr w:type="spellEnd"/>
-      <w:r>
-        <w:t xml:space="preserve"> or </w:t>
-      </w:r>
-      <w:proofErr w:type="spellStart"/>
-      <w:r>
-        <w:t>Bewehrung</w:t>
-      </w:r>
-      <w:proofErr w:type="spellEnd"/>
-      <w:r>
-        <w:t xml:space="preserve">, the corresponding sections </w:t>
-      </w:r>
-      <w:proofErr w:type="spellStart"/>
-      <w:r>
-        <w:t>Schnitt</w:t>
-      </w:r>
-      <w:proofErr w:type="spellEnd"/>
-      <w:r>
-        <w:t xml:space="preserve"> 1-1, </w:t>
-      </w:r>
-      <w:proofErr w:type="spellStart"/>
-      <w:r>
-        <w:t>Schnitt</w:t>
-      </w:r>
-      <w:proofErr w:type="spellEnd"/>
-      <w:r>
-        <w:t xml:space="preserve"> 2-2, and </w:t>
-      </w:r>
-      <w:proofErr w:type="spellStart"/>
-      <w:r>
-        <w:t>Schnitt</w:t>
-      </w:r>
-      <w:proofErr w:type="spellEnd"/>
-      <w:r>
-        <w:t xml:space="preserve"> 3-3 must all be provided.</w:t>
+        <w:t>For example, if sections 1-1, 2-2, and 3-3 are shown in the Ansicht or Bewehrung, the corresponding sections Schnitt 1-1, Schnitt 2-2, and Schnitt 3-3 must all be provided.</w:t>
       </w:r>
     </w:p>
     <w:p>
@@ -615,20 +511,7 @@
         </w:numPr>
       </w:pPr>
       <w:r>
-        <w:t xml:space="preserve">Check whether the component name on </w:t>
-      </w:r>
-      <w:proofErr w:type="gramStart"/>
-      <w:r>
-        <w:t xml:space="preserve">the </w:t>
-      </w:r>
-      <w:proofErr w:type="spellStart"/>
-      <w:r>
-        <w:t>Wandansicht</w:t>
-      </w:r>
-      <w:proofErr w:type="spellEnd"/>
-      <w:proofErr w:type="gramEnd"/>
-      <w:r>
-        <w:t xml:space="preserve"> matches the drawing name in the title block.</w:t>
+        <w:t>Check whether the component name on the Wandansicht matches the drawing name in the title block.</w:t>
       </w:r>
     </w:p>
     <w:p>
@@ -763,26 +646,10 @@
         <w:t xml:space="preserve">Check whether the wall </w:t>
       </w:r>
       <w:r>
-        <w:t xml:space="preserve">formwork </w:t>
-      </w:r>
-      <w:proofErr w:type="spellStart"/>
-      <w:r>
-        <w:t>Schnitt</w:t>
-      </w:r>
-      <w:proofErr w:type="spellEnd"/>
-      <w:r>
-        <w:t xml:space="preserve"> </w:t>
-      </w:r>
-      <w:r>
-        <w:t xml:space="preserve">grid lines match the </w:t>
-      </w:r>
-      <w:proofErr w:type="spellStart"/>
-      <w:r>
-        <w:t>Wandansicht</w:t>
-      </w:r>
-      <w:proofErr w:type="spellEnd"/>
-      <w:r>
-        <w:t>.</w:t>
+        <w:t xml:space="preserve">formwork Schnitt </w:t>
+      </w:r>
+      <w:r>
+        <w:t>grid lines match the Wandansicht.</w:t>
       </w:r>
     </w:p>
     <w:p>
@@ -899,23 +766,7 @@
         </w:numPr>
       </w:pPr>
       <w:r>
-        <w:t xml:space="preserve">Check whether the quantities of built-in parts and mounting parts in the </w:t>
-      </w:r>
-      <w:proofErr w:type="spellStart"/>
-      <w:r>
-        <w:t>Schnitt</w:t>
-      </w:r>
-      <w:proofErr w:type="spellEnd"/>
-      <w:r>
-        <w:t xml:space="preserve"> and </w:t>
-      </w:r>
-      <w:proofErr w:type="spellStart"/>
-      <w:r>
-        <w:t>Ansicht</w:t>
-      </w:r>
-      <w:proofErr w:type="spellEnd"/>
-      <w:r>
-        <w:t xml:space="preserve"> match the quantities in the schedules.</w:t>
+        <w:t>Check whether the quantities of built-in parts and mounting parts in the Schnitt and Ansicht match the quantities in the schedules.</w:t>
       </w:r>
     </w:p>
     <w:p>
@@ -1048,19 +899,13 @@
         <w:t>C</w:t>
       </w:r>
       <w:r>
-        <w:t>heck that the wall has a 3D view included.</w:t>
-      </w:r>
-      <w:r>
-        <w:br/>
-        <w:t>The wall view must match the elevation/section view (“</w:t>
-      </w:r>
-      <w:proofErr w:type="spellStart"/>
-      <w:r>
-        <w:t>Ansicht</w:t>
-      </w:r>
-      <w:proofErr w:type="spellEnd"/>
-      <w:r>
-        <w:t>”).</w:t>
+        <w:t>heck that the wall has a 3D view included</w:t>
+      </w:r>
+      <w:r>
+        <w:t xml:space="preserve">. The view of the wall in 45 </w:t>
+      </w:r>
+      <w:r>
+        <w:t>degrees</w:t>
       </w:r>
     </w:p>
     <w:p>
@@ -1112,8 +957,60 @@
     <w:p>
       <w:pPr>
         <w:pStyle w:val="ListParagraph"/>
+        <w:numPr>
+          <w:ilvl w:val="0"/>
+          <w:numId w:val="13"/>
+        </w:numPr>
+      </w:pPr>
+      <w:r>
+        <w:t>Check whether the drawing name matches the drawing name in the title block.</w:t>
+      </w:r>
+    </w:p>
+    <w:p>
+      <w:pPr>
+        <w:pStyle w:val="ListParagraph"/>
         <w:ind w:left="1080"/>
       </w:pPr>
+      <w:r>
+        <w:rPr>
+          <w:noProof/>
+        </w:rPr>
+        <w:drawing>
+          <wp:inline distT="0" distB="0" distL="0" distR="0" wp14:anchorId="06AB8EFE" wp14:editId="6C07B710">
+            <wp:extent cx="4056279" cy="2079075"/>
+            <wp:effectExtent l="0" t="0" r="1905" b="0"/>
+            <wp:docPr id="1814124236" name="Picture 1"/>
+            <wp:cNvGraphicFramePr>
+              <a:graphicFrameLocks xmlns:a="http://schemas.openxmlformats.org/drawingml/2006/main" noChangeAspect="1"/>
+            </wp:cNvGraphicFramePr>
+            <a:graphic xmlns:a="http://schemas.openxmlformats.org/drawingml/2006/main">
+              <a:graphicData uri="http://schemas.openxmlformats.org/drawingml/2006/picture">
+                <pic:pic xmlns:pic="http://schemas.openxmlformats.org/drawingml/2006/picture">
+                  <pic:nvPicPr>
+                    <pic:cNvPr id="1814124236" name=""/>
+                    <pic:cNvPicPr/>
+                  </pic:nvPicPr>
+                  <pic:blipFill>
+                    <a:blip r:embed="rId16"/>
+                    <a:stretch>
+                      <a:fillRect/>
+                    </a:stretch>
+                  </pic:blipFill>
+                  <pic:spPr>
+                    <a:xfrm>
+                      <a:off x="0" y="0"/>
+                      <a:ext cx="4060900" cy="2081443"/>
+                    </a:xfrm>
+                    <a:prstGeom prst="rect">
+                      <a:avLst/>
+                    </a:prstGeom>
+                  </pic:spPr>
+                </pic:pic>
+              </a:graphicData>
+            </a:graphic>
+          </wp:inline>
+        </w:drawing>
+      </w:r>
     </w:p>
     <w:p>
       <w:pPr>
@@ -1174,12 +1071,7 @@
         <w:t xml:space="preserve">  Overall status: PASS (all checks passed) | FAIL (one or more checks failed)</w:t>
       </w:r>
     </w:p>
-    <w:p>
-      <w:pPr>
-        <w:pStyle w:val="ListParagraph"/>
-        <w:ind w:left="1080"/>
-      </w:pPr>
-    </w:p>
+    <w:p/>
     <w:p>
       <w:pPr>
         <w:pStyle w:val="ListParagraph"/>
@@ -1202,35 +1094,27 @@
       <w:pPr>
         <w:pStyle w:val="ListParagraph"/>
       </w:pPr>
-      <w:proofErr w:type="gramStart"/>
-      <w:r>
-        <w:t>will be</w:t>
-      </w:r>
-      <w:proofErr w:type="gramEnd"/>
+      <w:r>
+        <w:t>will</w:t>
+      </w:r>
       <w:r>
         <w:t xml:space="preserve"> check </w:t>
       </w:r>
-      <w:proofErr w:type="gramStart"/>
-      <w:r>
-        <w:t>all of</w:t>
-      </w:r>
-      <w:proofErr w:type="gramEnd"/>
-      <w:r>
-        <w:t xml:space="preserve"> </w:t>
-      </w:r>
-      <w:proofErr w:type="gramStart"/>
-      <w:r>
-        <w:t>this</w:t>
-      </w:r>
-      <w:proofErr w:type="gramEnd"/>
-      <w:r>
-        <w:t xml:space="preserve"> issues below and report this pass or fail if fail display why it’s </w:t>
-      </w:r>
-      <w:proofErr w:type="gramStart"/>
-      <w:r>
-        <w:t>fail</w:t>
-      </w:r>
-      <w:proofErr w:type="gramEnd"/>
+      <w:r>
+        <w:t>all</w:t>
+      </w:r>
+      <w:r>
+        <w:t xml:space="preserve"> th</w:t>
+      </w:r>
+      <w:r>
+        <w:t>ese</w:t>
+      </w:r>
+      <w:r>
+        <w:t xml:space="preserve"> issues below and report this pass or fail if fail display why it’s fail</w:t>
+      </w:r>
+      <w:r>
+        <w:t>ed</w:t>
+      </w:r>
       <w:r>
         <w:t>.</w:t>
       </w:r>
@@ -1249,6 +1133,7 @@
         </w:numPr>
       </w:pPr>
       <w:r>
+        <w:lastRenderedPageBreak/>
         <w:t>Check whether the rebar positions on the drawing (excluding rebar positions greater than 100) match the positions in the detail drawings.</w:t>
       </w:r>
     </w:p>
@@ -1260,7 +1145,6 @@
         <w:rPr>
           <w:noProof/>
         </w:rPr>
-        <w:lastRenderedPageBreak/>
         <w:drawing>
           <wp:inline distT="0" distB="0" distL="0" distR="0" wp14:anchorId="3F002219" wp14:editId="6843C12B">
             <wp:extent cx="2754420" cy="2176915"/>
@@ -1277,7 +1161,7 @@
                     <pic:cNvPicPr/>
                   </pic:nvPicPr>
                   <pic:blipFill>
-                    <a:blip r:embed="rId16"/>
+                    <a:blip r:embed="rId17"/>
                     <a:stretch>
                       <a:fillRect/>
                     </a:stretch>
@@ -1335,7 +1219,7 @@
                     <pic:cNvPicPr/>
                   </pic:nvPicPr>
                   <pic:blipFill>
-                    <a:blip r:embed="rId17"/>
+                    <a:blip r:embed="rId18"/>
                     <a:stretch>
                       <a:fillRect/>
                     </a:stretch>
@@ -1393,7 +1277,7 @@
                     <pic:cNvPicPr/>
                   </pic:nvPicPr>
                   <pic:blipFill>
-                    <a:blip r:embed="rId18"/>
+                    <a:blip r:embed="rId19"/>
                     <a:stretch>
                       <a:fillRect/>
                     </a:stretch>
@@ -1426,21 +1310,7 @@
         <w:rPr>
           <w:color w:val="EE0000"/>
         </w:rPr>
-        <w:t>Ratio = (226.09/231.</w:t>
-      </w:r>
-      <w:proofErr w:type="gramStart"/>
-      <w:r>
-        <w:rPr>
-          <w:color w:val="EE0000"/>
-        </w:rPr>
-        <w:t>99)*</w:t>
-      </w:r>
-      <w:proofErr w:type="gramEnd"/>
-      <w:r>
-        <w:rPr>
-          <w:color w:val="EE0000"/>
-        </w:rPr>
-        <w:t>100 = 97.46%</w:t>
+        <w:t>Ratio = (226.09/231.99)*100 = 97.46%</w:t>
       </w:r>
       <w:r>
         <w:rPr>
@@ -1458,15 +1328,7 @@
         </w:numPr>
       </w:pPr>
       <w:r>
-        <w:t xml:space="preserve">Check whether the total mass in the </w:t>
-      </w:r>
-      <w:proofErr w:type="spellStart"/>
-      <w:r>
-        <w:t>Stabliste</w:t>
-      </w:r>
-      <w:proofErr w:type="spellEnd"/>
-      <w:r>
-        <w:t xml:space="preserve"> is correct.</w:t>
+        <w:t>Check whether the total mass in the Stabliste is correct.</w:t>
       </w:r>
     </w:p>
     <w:p>
@@ -1494,7 +1356,7 @@
                     <pic:cNvPicPr/>
                   </pic:nvPicPr>
                   <pic:blipFill>
-                    <a:blip r:embed="rId19"/>
+                    <a:blip r:embed="rId20"/>
                     <a:stretch>
                       <a:fillRect/>
                     </a:stretch>
@@ -1526,15 +1388,7 @@
         <w:t xml:space="preserve"> mass</w:t>
       </w:r>
       <w:r>
-        <w:t xml:space="preserve"> for </w:t>
-      </w:r>
-      <w:proofErr w:type="spellStart"/>
-      <w:r>
-        <w:t>Mattenstahlliste</w:t>
-      </w:r>
-      <w:proofErr w:type="spellEnd"/>
-      <w:r>
-        <w:t xml:space="preserve"> if available</w:t>
+        <w:t xml:space="preserve"> for Mattenstahlliste if available</w:t>
       </w:r>
     </w:p>
     <w:p>
@@ -1561,7 +1415,7 @@
                     <pic:cNvPicPr/>
                   </pic:nvPicPr>
                   <pic:blipFill>
-                    <a:blip r:embed="rId20"/>
+                    <a:blip r:embed="rId21"/>
                     <a:stretch>
                       <a:fillRect/>
                     </a:stretch>
@@ -1591,35 +1445,19 @@
         </w:numPr>
       </w:pPr>
       <w:r>
-        <w:t xml:space="preserve">Check the </w:t>
-      </w:r>
-      <w:proofErr w:type="spellStart"/>
-      <w:r>
-        <w:t>Bewehrung</w:t>
-      </w:r>
-      <w:proofErr w:type="spellEnd"/>
-      <w:r>
-        <w:t xml:space="preserve"> sections and their sub-</w:t>
-      </w:r>
-      <w:proofErr w:type="gramStart"/>
-      <w:r>
-        <w:t>sections, and</w:t>
-      </w:r>
-      <w:proofErr w:type="gramEnd"/>
+        <w:t>Check the Bewehrung sections and their sub-</w:t>
+      </w:r>
+      <w:r>
+        <w:t>sections and</w:t>
+      </w:r>
       <w:r>
         <w:t xml:space="preserve"> count the created rebar schemas.</w:t>
       </w:r>
       <w:r>
         <w:br/>
-        <w:t xml:space="preserve">Each rebar type in the </w:t>
-      </w:r>
-      <w:proofErr w:type="spellStart"/>
-      <w:r>
-        <w:t>Stabliste</w:t>
-      </w:r>
-      <w:proofErr w:type="spellEnd"/>
-      <w:r>
-        <w:t xml:space="preserve"> must be represented by at least one schema.</w:t>
+      </w:r>
+      <w:r>
+        <w:t>Each rebar type in the Stabliste must be represented by at least one schema. At least one scheme is required in the Bewehrung sections or their sub-sections.</w:t>
       </w:r>
     </w:p>
     <w:p>
@@ -1638,25 +1476,7 @@
           <w:sz w:val="19"/>
           <w:szCs w:val="22"/>
         </w:rPr>
-        <w:t xml:space="preserve">Example: in the </w:t>
-      </w:r>
-      <w:proofErr w:type="spellStart"/>
-      <w:r>
-        <w:rPr>
-          <w:rFonts w:ascii="Arial" w:eastAsia="Arial" w:hAnsi="Arial" w:cstheme="minorBidi"/>
-          <w:sz w:val="19"/>
-          <w:szCs w:val="22"/>
-        </w:rPr>
-        <w:t>Stabliste</w:t>
-      </w:r>
-      <w:proofErr w:type="spellEnd"/>
-      <w:r>
-        <w:rPr>
-          <w:rFonts w:ascii="Arial" w:eastAsia="Arial" w:hAnsi="Arial" w:cstheme="minorBidi"/>
-          <w:sz w:val="19"/>
-          <w:szCs w:val="22"/>
-        </w:rPr>
-        <w:t xml:space="preserve"> contains positions 1–19 and 100–104, each of these rebar positions must have at least one corresponding schema.</w:t>
+        <w:t>Example: in the Stabliste contains positions 1–19 and 100–104, each of these rebar positions must have at least one corresponding schema.</w:t>
       </w:r>
     </w:p>
     <w:p>
@@ -1671,11 +1491,10 @@
         <w:rPr>
           <w:noProof/>
         </w:rPr>
-        <w:lastRenderedPageBreak/>
         <w:drawing>
-          <wp:inline distT="0" distB="0" distL="0" distR="0" wp14:anchorId="501B1155" wp14:editId="343DDFAF">
-            <wp:extent cx="2193438" cy="3804598"/>
-            <wp:effectExtent l="0" t="0" r="0" b="5715"/>
+          <wp:inline distT="0" distB="0" distL="0" distR="0" wp14:anchorId="501B1155" wp14:editId="609C6445">
+            <wp:extent cx="1939995" cy="3364992"/>
+            <wp:effectExtent l="0" t="0" r="3175" b="6985"/>
             <wp:docPr id="211715538" name="Picture 1"/>
             <wp:cNvGraphicFramePr>
               <a:graphicFrameLocks xmlns:a="http://schemas.openxmlformats.org/drawingml/2006/main" noChangeAspect="1"/>
@@ -1688,7 +1507,7 @@
                     <pic:cNvPicPr/>
                   </pic:nvPicPr>
                   <pic:blipFill>
-                    <a:blip r:embed="rId21"/>
+                    <a:blip r:embed="rId22"/>
                     <a:stretch>
                       <a:fillRect/>
                     </a:stretch>
@@ -1696,7 +1515,7 @@
                   <pic:spPr>
                     <a:xfrm>
                       <a:off x="0" y="0"/>
-                      <a:ext cx="2196628" cy="3810131"/>
+                      <a:ext cx="1948290" cy="3379381"/>
                     </a:xfrm>
                     <a:prstGeom prst="rect">
                       <a:avLst/>
@@ -1719,9 +1538,9 @@
           <w:noProof/>
         </w:rPr>
         <w:drawing>
-          <wp:inline distT="0" distB="0" distL="0" distR="0" wp14:anchorId="4F0E97A2" wp14:editId="58099D77">
-            <wp:extent cx="1368796" cy="3787628"/>
-            <wp:effectExtent l="0" t="0" r="3175" b="3810"/>
+          <wp:inline distT="0" distB="0" distL="0" distR="0" wp14:anchorId="4F0E97A2" wp14:editId="41598A6C">
+            <wp:extent cx="1221638" cy="3380421"/>
+            <wp:effectExtent l="0" t="0" r="0" b="0"/>
             <wp:docPr id="1169470100" name="Picture 1"/>
             <wp:cNvGraphicFramePr>
               <a:graphicFrameLocks xmlns:a="http://schemas.openxmlformats.org/drawingml/2006/main" noChangeAspect="1"/>
@@ -1734,7 +1553,7 @@
                     <pic:cNvPicPr/>
                   </pic:nvPicPr>
                   <pic:blipFill>
-                    <a:blip r:embed="rId22"/>
+                    <a:blip r:embed="rId23"/>
                     <a:stretch>
                       <a:fillRect/>
                     </a:stretch>
@@ -1742,7 +1561,7 @@
                   <pic:spPr>
                     <a:xfrm>
                       <a:off x="0" y="0"/>
-                      <a:ext cx="1381999" cy="3824161"/>
+                      <a:ext cx="1247097" cy="3450869"/>
                     </a:xfrm>
                     <a:prstGeom prst="rect">
                       <a:avLst/>
@@ -1764,6 +1583,7 @@
         <w:rPr>
           <w:noProof/>
         </w:rPr>
+        <w:lastRenderedPageBreak/>
         <w:drawing>
           <wp:inline distT="0" distB="0" distL="0" distR="0" wp14:anchorId="391FE950" wp14:editId="7F9EAF8D">
             <wp:extent cx="3696308" cy="2217714"/>
@@ -1780,7 +1600,7 @@
                     <pic:cNvPicPr/>
                   </pic:nvPicPr>
                   <pic:blipFill>
-                    <a:blip r:embed="rId23"/>
+                    <a:blip r:embed="rId24"/>
                     <a:stretch>
                       <a:fillRect/>
                     </a:stretch>
@@ -1826,7 +1646,7 @@
                     <pic:cNvPicPr/>
                   </pic:nvPicPr>
                   <pic:blipFill>
-                    <a:blip r:embed="rId24"/>
+                    <a:blip r:embed="rId25"/>
                     <a:stretch>
                       <a:fillRect/>
                     </a:stretch>
@@ -1915,15 +1735,7 @@
         <w:t xml:space="preserve"> </w:t>
       </w:r>
       <w:r>
-        <w:t xml:space="preserve">→ </w:t>
-      </w:r>
-      <w:proofErr w:type="spellStart"/>
-      <w:r>
-        <w:t>dbr</w:t>
-      </w:r>
-      <w:proofErr w:type="spellEnd"/>
-      <w:r>
-        <w:t xml:space="preserve"> = 3.2 </w:t>
+        <w:t xml:space="preserve">→ dbr = 3.2 </w:t>
       </w:r>
     </w:p>
     <w:p>
@@ -1952,15 +1764,7 @@
         <w:t xml:space="preserve"> </w:t>
       </w:r>
       <w:r>
-        <w:t xml:space="preserve">→ </w:t>
-      </w:r>
-      <w:proofErr w:type="spellStart"/>
-      <w:r>
-        <w:t>dbr</w:t>
-      </w:r>
-      <w:proofErr w:type="spellEnd"/>
-      <w:r>
-        <w:t xml:space="preserve"> = 4</w:t>
+        <w:t>→ dbr = 4</w:t>
       </w:r>
     </w:p>
     <w:p>
@@ -1972,7 +1776,6 @@
         </w:numPr>
       </w:pPr>
       <w:r>
-        <w:lastRenderedPageBreak/>
         <w:t>Ø1</w:t>
       </w:r>
       <w:r>
@@ -1996,15 +1799,7 @@
         <w:t xml:space="preserve"> </w:t>
       </w:r>
       <w:r>
-        <w:t xml:space="preserve">→ </w:t>
-      </w:r>
-      <w:proofErr w:type="spellStart"/>
-      <w:r>
-        <w:t>dbr</w:t>
-      </w:r>
-      <w:proofErr w:type="spellEnd"/>
-      <w:r>
-        <w:t xml:space="preserve"> = 4</w:t>
+        <w:t>→ dbr = 4</w:t>
       </w:r>
       <w:r>
         <w:t>.8</w:t>
@@ -2035,15 +1830,7 @@
         <w:t xml:space="preserve">4 </w:t>
       </w:r>
       <w:r>
-        <w:t xml:space="preserve">→ </w:t>
-      </w:r>
-      <w:proofErr w:type="spellStart"/>
-      <w:r>
-        <w:t>dbr</w:t>
-      </w:r>
-      <w:proofErr w:type="spellEnd"/>
-      <w:r>
-        <w:t xml:space="preserve"> = </w:t>
+        <w:t xml:space="preserve">→ dbr = </w:t>
       </w:r>
       <w:r>
         <w:t>6.4</w:t>
@@ -2074,15 +1861,7 @@
         <w:t xml:space="preserve">7 </w:t>
       </w:r>
       <w:r>
-        <w:t xml:space="preserve">→ </w:t>
-      </w:r>
-      <w:proofErr w:type="spellStart"/>
-      <w:r>
-        <w:t>dbr</w:t>
-      </w:r>
-      <w:proofErr w:type="spellEnd"/>
-      <w:r>
-        <w:t xml:space="preserve"> = </w:t>
+        <w:t xml:space="preserve">→ dbr = </w:t>
       </w:r>
       <w:r>
         <w:t>14</w:t>
@@ -2113,15 +1892,7 @@
         <w:t xml:space="preserve">7 </w:t>
       </w:r>
       <w:r>
-        <w:t xml:space="preserve">→ </w:t>
-      </w:r>
-      <w:proofErr w:type="spellStart"/>
-      <w:r>
-        <w:t>dbr</w:t>
-      </w:r>
-      <w:proofErr w:type="spellEnd"/>
-      <w:r>
-        <w:t xml:space="preserve"> = </w:t>
+        <w:t xml:space="preserve">→ dbr = </w:t>
       </w:r>
       <w:r>
         <w:t>16</w:t>
@@ -2155,15 +1926,7 @@
         <w:t xml:space="preserve">7 </w:t>
       </w:r>
       <w:r>
-        <w:t xml:space="preserve">→ </w:t>
-      </w:r>
-      <w:proofErr w:type="spellStart"/>
-      <w:r>
-        <w:t>dbr</w:t>
-      </w:r>
-      <w:proofErr w:type="spellEnd"/>
-      <w:r>
-        <w:t xml:space="preserve"> = </w:t>
+        <w:t xml:space="preserve">→ dbr = </w:t>
       </w:r>
       <w:r>
         <w:t>19</w:t>
@@ -2206,21 +1969,29 @@
         <w:t xml:space="preserve"> is correct</w:t>
       </w:r>
       <w:r>
-        <w:t xml:space="preserve"> and match with </w:t>
-      </w:r>
-      <w:proofErr w:type="spellStart"/>
-      <w:r>
-        <w:t>Einzel</w:t>
-      </w:r>
-      <w:proofErr w:type="spellEnd"/>
-      <w:r>
-        <w:t xml:space="preserve"> Lange in </w:t>
-      </w:r>
-      <w:proofErr w:type="spellStart"/>
-      <w:r>
-        <w:t>Stabliste</w:t>
-      </w:r>
-      <w:proofErr w:type="spellEnd"/>
+        <w:t xml:space="preserve"> and match with Einzel Lange in Stabliste</w:t>
+      </w:r>
+    </w:p>
+    <w:p>
+      <w:pPr>
+        <w:pStyle w:val="ListParagraph"/>
+        <w:ind w:left="1080"/>
+        <w:rPr>
+          <w:color w:val="EE0000"/>
+        </w:rPr>
+      </w:pPr>
+      <w:r>
+        <w:rPr>
+          <w:color w:val="EE0000"/>
+        </w:rPr>
+        <w:t>Pos 102</w:t>
+      </w:r>
+      <w:r>
+        <w:rPr>
+          <w:color w:val="EE0000"/>
+        </w:rPr>
+        <w:t xml:space="preserve"> = 41+16+16+41 = 114 (correct)</w:t>
+      </w:r>
     </w:p>
     <w:p>
       <w:pPr>
@@ -2231,6 +2002,7 @@
         </w:rPr>
       </w:pPr>
       <w:r>
+        <w:lastRenderedPageBreak/>
         <w:t xml:space="preserve">Example: </w:t>
       </w:r>
       <w:r>
@@ -2253,7 +2025,7 @@
                     <pic:cNvPicPr/>
                   </pic:nvPicPr>
                   <pic:blipFill>
-                    <a:blip r:embed="rId25"/>
+                    <a:blip r:embed="rId26"/>
                     <a:stretch>
                       <a:fillRect/>
                     </a:stretch>
@@ -2299,7 +2071,7 @@
                     <pic:cNvPicPr/>
                   </pic:nvPicPr>
                   <pic:blipFill>
-                    <a:blip r:embed="rId26"/>
+                    <a:blip r:embed="rId27"/>
                     <a:stretch>
                       <a:fillRect/>
                     </a:stretch>
@@ -2430,37 +2202,8 @@
       <w:pPr>
         <w:pStyle w:val="ListParagraph"/>
       </w:pPr>
-      <w:proofErr w:type="gramStart"/>
-      <w:r>
-        <w:t>will be</w:t>
-      </w:r>
-      <w:proofErr w:type="gramEnd"/>
-      <w:r>
-        <w:t xml:space="preserve"> check </w:t>
-      </w:r>
-      <w:proofErr w:type="gramStart"/>
-      <w:r>
-        <w:t>all of</w:t>
-      </w:r>
-      <w:proofErr w:type="gramEnd"/>
-      <w:r>
-        <w:t xml:space="preserve"> </w:t>
-      </w:r>
-      <w:proofErr w:type="gramStart"/>
-      <w:r>
-        <w:t>this</w:t>
-      </w:r>
-      <w:proofErr w:type="gramEnd"/>
-      <w:r>
-        <w:t xml:space="preserve"> issues below and report this pass or fail if fail display why it’s </w:t>
-      </w:r>
-      <w:proofErr w:type="gramStart"/>
-      <w:r>
-        <w:t>fail</w:t>
-      </w:r>
-      <w:proofErr w:type="gramEnd"/>
-      <w:r>
-        <w:t>.</w:t>
+      <w:r>
+        <w:t>will be check all of this issues below and report this pass or fail if fail display why it’s fail.</w:t>
       </w:r>
     </w:p>
     <w:p>
@@ -2483,6 +2226,12 @@
       <w:r>
         <w:t xml:space="preserve"> reinforcement label includes the suffix “-M.E.” at the end.</w:t>
       </w:r>
+      <w:r>
+        <w:t xml:space="preserve"> Only two types of this rebar is Spacers/Clamps</w:t>
+      </w:r>
+      <w:r>
+        <w:t xml:space="preserve"> reinforcement</w:t>
+      </w:r>
     </w:p>
     <w:p>
       <w:pPr>
@@ -2496,6 +2245,7 @@
         <w:rPr>
           <w:noProof/>
         </w:rPr>
+        <w:lastRenderedPageBreak/>
         <w:drawing>
           <wp:inline distT="0" distB="0" distL="0" distR="0" wp14:anchorId="42AA55D9" wp14:editId="733E3863">
             <wp:extent cx="2086851" cy="1318408"/>
@@ -2512,7 +2262,7 @@
                     <pic:cNvPicPr/>
                   </pic:nvPicPr>
                   <pic:blipFill>
-                    <a:blip r:embed="rId27"/>
+                    <a:blip r:embed="rId28"/>
                     <a:stretch>
                       <a:fillRect/>
                     </a:stretch>
@@ -2521,6 +2271,52 @@
                     <a:xfrm>
                       <a:off x="0" y="0"/>
                       <a:ext cx="2091173" cy="1321139"/>
+                    </a:xfrm>
+                    <a:prstGeom prst="rect">
+                      <a:avLst/>
+                    </a:prstGeom>
+                  </pic:spPr>
+                </pic:pic>
+              </a:graphicData>
+            </a:graphic>
+          </wp:inline>
+        </w:drawing>
+      </w:r>
+      <w:r>
+        <w:rPr>
+          <w:noProof/>
+        </w:rPr>
+        <w:t xml:space="preserve"> </w:t>
+      </w:r>
+      <w:r>
+        <w:rPr>
+          <w:noProof/>
+        </w:rPr>
+        <w:drawing>
+          <wp:inline distT="0" distB="0" distL="0" distR="0" wp14:anchorId="2A0FEB2A" wp14:editId="618C2743">
+            <wp:extent cx="1367942" cy="1747926"/>
+            <wp:effectExtent l="0" t="0" r="3810" b="5080"/>
+            <wp:docPr id="704904677" name="Picture 1"/>
+            <wp:cNvGraphicFramePr>
+              <a:graphicFrameLocks xmlns:a="http://schemas.openxmlformats.org/drawingml/2006/main" noChangeAspect="1"/>
+            </wp:cNvGraphicFramePr>
+            <a:graphic xmlns:a="http://schemas.openxmlformats.org/drawingml/2006/main">
+              <a:graphicData uri="http://schemas.openxmlformats.org/drawingml/2006/picture">
+                <pic:pic xmlns:pic="http://schemas.openxmlformats.org/drawingml/2006/picture">
+                  <pic:nvPicPr>
+                    <pic:cNvPr id="704904677" name=""/>
+                    <pic:cNvPicPr/>
+                  </pic:nvPicPr>
+                  <pic:blipFill>
+                    <a:blip r:embed="rId29"/>
+                    <a:stretch>
+                      <a:fillRect/>
+                    </a:stretch>
+                  </pic:blipFill>
+                  <pic:spPr>
+                    <a:xfrm>
+                      <a:off x="0" y="0"/>
+                      <a:ext cx="1380431" cy="1763885"/>
                     </a:xfrm>
                     <a:prstGeom prst="rect">
                       <a:avLst/>
@@ -2558,7 +2354,7 @@
                     <pic:cNvPicPr/>
                   </pic:nvPicPr>
                   <pic:blipFill>
-                    <a:blip r:embed="rId28"/>
+                    <a:blip r:embed="rId30"/>
                     <a:stretch>
                       <a:fillRect/>
                     </a:stretch>
@@ -2600,23 +2396,7 @@
         </w:numPr>
       </w:pPr>
       <w:r>
-        <w:t xml:space="preserve">Vertical pin = </w:t>
-      </w:r>
-      <w:proofErr w:type="spellStart"/>
-      <w:r>
-        <w:t>wall_width</w:t>
-      </w:r>
-      <w:proofErr w:type="spellEnd"/>
-      <w:r>
-        <w:t xml:space="preserve"> – 2*</w:t>
-      </w:r>
-      <w:proofErr w:type="spellStart"/>
-      <w:r>
-        <w:t>Cv</w:t>
-      </w:r>
-      <w:proofErr w:type="spellEnd"/>
-      <w:r>
-        <w:t xml:space="preserve"> </w:t>
+        <w:t xml:space="preserve">Vertical pin = wall_width – 2*Cv </w:t>
       </w:r>
     </w:p>
     <w:p>
@@ -2624,14 +2404,8 @@
         <w:pStyle w:val="ListParagraph"/>
         <w:ind w:left="1800"/>
       </w:pPr>
-      <w:proofErr w:type="spellStart"/>
-      <w:r>
-        <w:lastRenderedPageBreak/>
-        <w:t>Cv</w:t>
-      </w:r>
-      <w:proofErr w:type="spellEnd"/>
-      <w:r>
-        <w:t xml:space="preserve"> value in detail </w:t>
+      <w:r>
+        <w:t xml:space="preserve">Cv value in detail </w:t>
       </w:r>
     </w:p>
     <w:p>
@@ -2639,6 +2413,9 @@
         <w:pStyle w:val="ListParagraph"/>
         <w:ind w:left="1800"/>
       </w:pPr>
+      <w:r>
+        <w:t>A vertical pin is a vertically placed pin that is usually shown in the cross-section next to the Bewehrung. In this example, it is rebar position 5.</w:t>
+      </w:r>
       <w:r>
         <w:rPr>
           <w:noProof/>
@@ -2659,7 +2436,7 @@
                     <pic:cNvPicPr/>
                   </pic:nvPicPr>
                   <pic:blipFill>
-                    <a:blip r:embed="rId29"/>
+                    <a:blip r:embed="rId31"/>
                     <a:stretch>
                       <a:fillRect/>
                     </a:stretch>
@@ -2688,19 +2465,11 @@
           <w:color w:val="EE0000"/>
         </w:rPr>
       </w:pPr>
-      <w:proofErr w:type="spellStart"/>
       <w:r>
         <w:rPr>
           <w:color w:val="EE0000"/>
         </w:rPr>
-        <w:t>Width_ver_pin</w:t>
-      </w:r>
-      <w:proofErr w:type="spellEnd"/>
-      <w:r>
-        <w:rPr>
-          <w:color w:val="EE0000"/>
-        </w:rPr>
-        <w:t xml:space="preserve"> = 30 – 2*2.5 = 25</w:t>
+        <w:t>Width_ver_pin = 30 – 2*2.5 = 25</w:t>
       </w:r>
     </w:p>
     <w:p>
@@ -2712,23 +2481,7 @@
         </w:numPr>
       </w:pPr>
       <w:r>
-        <w:t xml:space="preserve">Horizontal pin = </w:t>
-      </w:r>
-      <w:proofErr w:type="spellStart"/>
-      <w:r>
-        <w:t>wall_width</w:t>
-      </w:r>
-      <w:proofErr w:type="spellEnd"/>
-      <w:r>
-        <w:t xml:space="preserve"> – 2*</w:t>
-      </w:r>
-      <w:proofErr w:type="spellStart"/>
-      <w:r>
-        <w:t>Cv</w:t>
-      </w:r>
-      <w:proofErr w:type="spellEnd"/>
-      <w:r>
-        <w:t xml:space="preserve"> – 2*Layer1 rebar </w:t>
+        <w:t xml:space="preserve">Horizontal pin = wall_width – 2*Cv – 2*Layer1 rebar </w:t>
       </w:r>
       <w:r>
         <w:t xml:space="preserve">diameter </w:t>
@@ -2768,7 +2521,7 @@
                     <pic:cNvPicPr/>
                   </pic:nvPicPr>
                   <pic:blipFill>
-                    <a:blip r:embed="rId30"/>
+                    <a:blip r:embed="rId32"/>
                     <a:stretch>
                       <a:fillRect/>
                     </a:stretch>
@@ -2794,13 +2547,8 @@
         <w:pStyle w:val="ListParagraph"/>
         <w:ind w:left="1800"/>
       </w:pPr>
-      <w:proofErr w:type="spellStart"/>
-      <w:r>
-        <w:t>Cv</w:t>
-      </w:r>
-      <w:proofErr w:type="spellEnd"/>
-      <w:r>
-        <w:t xml:space="preserve"> value in detail </w:t>
+      <w:r>
+        <w:t xml:space="preserve">Cv value in detail </w:t>
       </w:r>
     </w:p>
     <w:p>
@@ -2808,21 +2556,18 @@
         <w:pStyle w:val="ListParagraph"/>
         <w:ind w:left="1800"/>
       </w:pPr>
-      <w:proofErr w:type="gramStart"/>
-      <w:r>
-        <w:t>Layer1</w:t>
-      </w:r>
-      <w:proofErr w:type="gramEnd"/>
-      <w:r>
-        <w:t xml:space="preserve"> rebar diameter </w:t>
-      </w:r>
-      <w:proofErr w:type="gramStart"/>
-      <w:r>
-        <w:t>detect</w:t>
-      </w:r>
-      <w:proofErr w:type="gramEnd"/>
-      <w:r>
-        <w:t xml:space="preserve"> the label in the side section of the wall (example is </w:t>
+      <w:r>
+        <w:t>A horizontal pin is a horizontally placed pin that is usually shown in the bottom cross-section of the Bewehrung. In this example, it is rebar position 4.</w:t>
+      </w:r>
+    </w:p>
+    <w:p>
+      <w:pPr>
+        <w:pStyle w:val="ListParagraph"/>
+        <w:ind w:left="1800"/>
+      </w:pPr>
+      <w:r>
+        <w:lastRenderedPageBreak/>
+        <w:t xml:space="preserve">Layer1 rebar diameter detect the label in the side section of the wall (example is </w:t>
       </w:r>
       <w:r>
         <w:t>position</w:t>
@@ -2839,7 +2584,6 @@
           <w:color w:val="EE0000"/>
         </w:rPr>
       </w:pPr>
-      <w:proofErr w:type="spellStart"/>
       <w:r>
         <w:rPr>
           <w:color w:val="EE0000"/>
@@ -2856,14 +2600,7 @@
         <w:rPr>
           <w:color w:val="EE0000"/>
         </w:rPr>
-        <w:t>_pin</w:t>
-      </w:r>
-      <w:proofErr w:type="spellEnd"/>
-      <w:r>
-        <w:rPr>
-          <w:color w:val="EE0000"/>
-        </w:rPr>
-        <w:t xml:space="preserve"> = 30 – 2*2.5</w:t>
+        <w:t>_pin = 30 – 2*2.5</w:t>
       </w:r>
       <w:r>
         <w:rPr>
@@ -2914,23 +2651,7 @@
         <w:ind w:left="1080"/>
       </w:pPr>
       <w:r>
-        <w:t xml:space="preserve">Spacers/Clamps = </w:t>
-      </w:r>
-      <w:proofErr w:type="spellStart"/>
-      <w:r>
-        <w:t>wall_width</w:t>
-      </w:r>
-      <w:proofErr w:type="spellEnd"/>
-      <w:r>
-        <w:t xml:space="preserve"> – 2*</w:t>
-      </w:r>
-      <w:proofErr w:type="spellStart"/>
-      <w:r>
-        <w:t>Cv</w:t>
-      </w:r>
-      <w:proofErr w:type="spellEnd"/>
-      <w:r>
-        <w:t xml:space="preserve"> – 2*Spacer diameter (</w:t>
+        <w:t>Spacers/Clamps = wall_width – 2*Cv – 2*Spacer diameter (</w:t>
       </w:r>
       <w:r>
         <w:t xml:space="preserve">round </w:t>
@@ -2944,13 +2665,8 @@
         <w:pStyle w:val="ListParagraph"/>
         <w:ind w:left="1080"/>
       </w:pPr>
-      <w:proofErr w:type="spellStart"/>
-      <w:r>
-        <w:t>Cv</w:t>
-      </w:r>
-      <w:proofErr w:type="spellEnd"/>
-      <w:r>
-        <w:t xml:space="preserve"> value in detail </w:t>
+      <w:r>
+        <w:t xml:space="preserve">Cv value in detail </w:t>
       </w:r>
     </w:p>
     <w:p>
@@ -2958,21 +2674,8 @@
         <w:pStyle w:val="ListParagraph"/>
         <w:ind w:left="1080"/>
       </w:pPr>
-      <w:proofErr w:type="gramStart"/>
-      <w:r>
-        <w:t>Layer1</w:t>
-      </w:r>
-      <w:proofErr w:type="gramEnd"/>
-      <w:r>
-        <w:t xml:space="preserve"> rebar diameter </w:t>
-      </w:r>
-      <w:proofErr w:type="gramStart"/>
-      <w:r>
-        <w:t>detect</w:t>
-      </w:r>
-      <w:proofErr w:type="gramEnd"/>
-      <w:r>
-        <w:t xml:space="preserve"> the label in the side section of the wall (example is position 12)</w:t>
+      <w:r>
+        <w:t>Layer1 rebar diameter detect the label in the side section of the wall (example is position 12)</w:t>
       </w:r>
     </w:p>
     <w:p>
@@ -2983,7 +2686,6 @@
           <w:color w:val="EE0000"/>
         </w:rPr>
       </w:pPr>
-      <w:proofErr w:type="spellStart"/>
       <w:r>
         <w:rPr>
           <w:color w:val="EE0000"/>
@@ -3000,14 +2702,7 @@
         <w:rPr>
           <w:color w:val="EE0000"/>
         </w:rPr>
-        <w:t>_pin</w:t>
-      </w:r>
-      <w:proofErr w:type="spellEnd"/>
-      <w:r>
-        <w:rPr>
-          <w:color w:val="EE0000"/>
-        </w:rPr>
-        <w:t xml:space="preserve"> = 30 – 2*2.5</w:t>
+        <w:t>_pin = 30 – 2*2.5</w:t>
       </w:r>
       <w:r>
         <w:rPr>
@@ -3071,7 +2766,7 @@
                     <pic:cNvPicPr/>
                   </pic:nvPicPr>
                   <pic:blipFill>
-                    <a:blip r:embed="rId31"/>
+                    <a:blip r:embed="rId33"/>
                     <a:stretch>
                       <a:fillRect/>
                     </a:stretch>
@@ -3121,7 +2816,6 @@
         <w:pStyle w:val="ListParagraph"/>
       </w:pPr>
       <w:r>
-        <w:lastRenderedPageBreak/>
         <w:t xml:space="preserve">  [CHECK NAME]: PASS | FAIL</w:t>
       </w:r>
     </w:p>

</xml_diff>